<commit_message>
aggiornato metodo password, variabile aggiornata
</commit_message>
<xml_diff>
--- a/4_Diari/2025.04.30.docx
+++ b/4_Diari/2025.04.30.docx
@@ -754,9 +754,9 @@
                 <w:noProof/>
               </w:rPr>
               <w:drawing>
-                <wp:inline distT="0" distB="0" distL="0" distR="0" wp14:anchorId="339BD616" wp14:editId="70286DE2">
-                  <wp:extent cx="3364302" cy="4880086"/>
-                  <wp:effectExtent l="0" t="0" r="7620" b="0"/>
+                <wp:inline distT="0" distB="0" distL="0" distR="0" wp14:anchorId="7ED88060" wp14:editId="02ACD1E5">
+                  <wp:extent cx="6120130" cy="3117850"/>
+                  <wp:effectExtent l="0" t="0" r="0" b="6350"/>
                   <wp:docPr id="1" name="Immagine 1"/>
                   <wp:cNvGraphicFramePr>
                     <a:graphicFrameLocks xmlns:a="http://schemas.openxmlformats.org/drawingml/2006/main" noChangeAspect="1"/>
@@ -777,7 +777,7 @@
                         <pic:spPr>
                           <a:xfrm>
                             <a:off x="0" y="0"/>
-                            <a:ext cx="3367996" cy="4885444"/>
+                            <a:ext cx="6120130" cy="3117850"/>
                           </a:xfrm>
                           <a:prstGeom prst="rect">
                             <a:avLst/>
@@ -917,8 +917,28 @@
               <w:rPr>
                 <w:rFonts w:ascii="Arial" w:hAnsi="Arial" w:cs="Arial"/>
               </w:rPr>
-              <w:t>, abbiamo diversi problemi negli allegati e stiamo valutando di togliere la registrazione audio per mancanze di tempo.</w:t>
+              <w:t>, abbiamo diversi problemi negli allegati e stiamo valutando di togliere la registrazione audio per mancanz</w:t>
             </w:r>
+            <w:r>
+              <w:rPr>
+                <w:rFonts w:ascii="Arial" w:hAnsi="Arial" w:cs="Arial"/>
+              </w:rPr>
+              <w:t xml:space="preserve">a </w:t>
+            </w:r>
+            <w:r>
+              <w:rPr>
+                <w:rFonts w:ascii="Arial" w:hAnsi="Arial" w:cs="Arial"/>
+              </w:rPr>
+              <w:t>di tempo</w:t>
+            </w:r>
+            <w:r>
+              <w:rPr>
+                <w:rFonts w:ascii="Arial" w:hAnsi="Arial" w:cs="Arial"/>
+              </w:rPr>
+              <w:t>, per il resto abbiamo notato una mancanza di informazione per l’utente, deciso di mostrare nome e email all’utente.</w:t>
+            </w:r>
+            <w:bookmarkStart w:id="3" w:name="_GoBack"/>
+            <w:bookmarkEnd w:id="3"/>
           </w:p>
         </w:tc>
       </w:tr>
@@ -929,8 +949,6 @@
           <w:rFonts w:ascii="Arial" w:hAnsi="Arial" w:cs="Arial"/>
         </w:rPr>
       </w:pPr>
-      <w:bookmarkStart w:id="3" w:name="_GoBack"/>
-      <w:bookmarkEnd w:id="3"/>
     </w:p>
     <w:sectPr>
       <w:headerReference w:type="default" r:id="rId9"/>
@@ -5285,6 +5303,7 @@
     <w:rsid w:val="00F6635C"/>
     <w:rsid w:val="00F902BF"/>
     <w:rsid w:val="00F93792"/>
+    <w:rsid w:val="00FA10BC"/>
     <w:rsid w:val="00FA1CED"/>
     <w:rsid w:val="00FC1BC6"/>
     <w:rsid w:val="00FD1B19"/>
@@ -6081,7 +6100,7 @@
 </file>
 
 <file path=customXml/itemProps1.xml><?xml version="1.0" encoding="utf-8"?>
-<ds:datastoreItem xmlns:ds="http://schemas.openxmlformats.org/officeDocument/2006/customXml" ds:itemID="{F1781025-6201-4B1E-805F-89873F9AA1C8}">
+<ds:datastoreItem xmlns:ds="http://schemas.openxmlformats.org/officeDocument/2006/customXml" ds:itemID="{3E1C8208-4EAC-40DD-8330-F38A74D49842}">
   <ds:schemaRefs>
     <ds:schemaRef ds:uri="http://schemas.openxmlformats.org/officeDocument/2006/bibliography"/>
   </ds:schemaRefs>

</xml_diff>

<commit_message>
aggiunto visualizzazione del nome e della mail dal profilo
</commit_message>
<xml_diff>
--- a/4_Diari/2025.04.30.docx
+++ b/4_Diari/2025.04.30.docx
@@ -205,42 +205,6 @@
               <w:rPr>
                 <w:rFonts w:ascii="Arial" w:hAnsi="Arial" w:cs="Arial"/>
               </w:rPr>
-              <w:t>Aggiornato la documentazione</w:t>
-            </w:r>
-          </w:p>
-          <w:p>
-            <w:pPr>
-              <w:pStyle w:val="Paragrafoelenco"/>
-              <w:numPr>
-                <w:ilvl w:val="1"/>
-                <w:numId w:val="21"/>
-              </w:numPr>
-              <w:rPr>
-                <w:rFonts w:ascii="Arial" w:hAnsi="Arial" w:cs="Arial"/>
-              </w:rPr>
-            </w:pPr>
-            <w:r>
-              <w:rPr>
-                <w:rFonts w:ascii="Arial" w:hAnsi="Arial" w:cs="Arial"/>
-              </w:rPr>
-              <w:t>Migliorata e aggiornato problema con intestazione</w:t>
-            </w:r>
-          </w:p>
-          <w:p>
-            <w:pPr>
-              <w:pStyle w:val="Paragrafoelenco"/>
-              <w:numPr>
-                <w:ilvl w:val="0"/>
-                <w:numId w:val="21"/>
-              </w:numPr>
-              <w:rPr>
-                <w:rFonts w:ascii="Arial" w:hAnsi="Arial" w:cs="Arial"/>
-              </w:rPr>
-            </w:pPr>
-            <w:r>
-              <w:rPr>
-                <w:rFonts w:ascii="Arial" w:hAnsi="Arial" w:cs="Arial"/>
-              </w:rPr>
               <w:t>Profilo</w:t>
             </w:r>
           </w:p>
@@ -259,7 +223,21 @@
               <w:rPr>
                 <w:rFonts w:ascii="Arial" w:hAnsi="Arial" w:cs="Arial"/>
               </w:rPr>
-              <w:t>Gestione email, controllo se email già registrata</w:t>
+              <w:t>Aggiunto nome e email dell’</w:t>
+            </w:r>
+            <w:proofErr w:type="spellStart"/>
+            <w:r>
+              <w:rPr>
+                <w:rFonts w:ascii="Arial" w:hAnsi="Arial" w:cs="Arial"/>
+              </w:rPr>
+              <w:t>uente</w:t>
+            </w:r>
+            <w:proofErr w:type="spellEnd"/>
+            <w:r>
+              <w:rPr>
+                <w:rFonts w:ascii="Arial" w:hAnsi="Arial" w:cs="Arial"/>
+              </w:rPr>
+              <w:t xml:space="preserve"> nella pagina</w:t>
             </w:r>
           </w:p>
           <w:p>
@@ -277,8 +255,166 @@
               <w:rPr>
                 <w:rFonts w:ascii="Arial" w:hAnsi="Arial" w:cs="Arial"/>
               </w:rPr>
-              <w:t>Cambiare nome da pagina profilo</w:t>
+              <w:t>Aggiornato con la nuova validazione della password</w:t>
             </w:r>
+          </w:p>
+          <w:p>
+            <w:pPr>
+              <w:pStyle w:val="Paragrafoelenco"/>
+              <w:numPr>
+                <w:ilvl w:val="0"/>
+                <w:numId w:val="21"/>
+              </w:numPr>
+              <w:rPr>
+                <w:rFonts w:ascii="Arial" w:hAnsi="Arial" w:cs="Arial"/>
+              </w:rPr>
+            </w:pPr>
+            <w:r>
+              <w:rPr>
+                <w:rFonts w:ascii="Arial" w:hAnsi="Arial" w:cs="Arial"/>
+              </w:rPr>
+              <w:t>Registrazione</w:t>
+            </w:r>
+          </w:p>
+          <w:p>
+            <w:pPr>
+              <w:pStyle w:val="Paragrafoelenco"/>
+              <w:numPr>
+                <w:ilvl w:val="1"/>
+                <w:numId w:val="21"/>
+              </w:numPr>
+              <w:rPr>
+                <w:rFonts w:ascii="Arial" w:hAnsi="Arial" w:cs="Arial"/>
+              </w:rPr>
+            </w:pPr>
+            <w:r>
+              <w:rPr>
+                <w:rFonts w:ascii="Arial" w:hAnsi="Arial" w:cs="Arial"/>
+              </w:rPr>
+              <w:t>Aggiunto validazione della password, resa più sicura (caratteri speciali, numeri, lunghezza minima, ...)</w:t>
+            </w:r>
+            <w:r>
+              <w:rPr>
+                <w:rFonts w:ascii="Arial" w:hAnsi="Arial" w:cs="Arial"/>
+              </w:rPr>
+              <w:t>, con tanto di informazione disponibile per fare la password sicura</w:t>
+            </w:r>
+          </w:p>
+          <w:p>
+            <w:pPr>
+              <w:pStyle w:val="Paragrafoelenco"/>
+              <w:numPr>
+                <w:ilvl w:val="0"/>
+                <w:numId w:val="21"/>
+              </w:numPr>
+              <w:rPr>
+                <w:rFonts w:ascii="Arial" w:hAnsi="Arial" w:cs="Arial"/>
+              </w:rPr>
+            </w:pPr>
+            <w:r>
+              <w:rPr>
+                <w:rFonts w:ascii="Arial" w:hAnsi="Arial" w:cs="Arial"/>
+              </w:rPr>
+              <w:t>Database</w:t>
+            </w:r>
+          </w:p>
+          <w:p>
+            <w:pPr>
+              <w:pStyle w:val="Paragrafoelenco"/>
+              <w:numPr>
+                <w:ilvl w:val="1"/>
+                <w:numId w:val="21"/>
+              </w:numPr>
+              <w:rPr>
+                <w:rFonts w:ascii="Arial" w:hAnsi="Arial" w:cs="Arial"/>
+              </w:rPr>
+            </w:pPr>
+            <w:r>
+              <w:rPr>
+                <w:rFonts w:ascii="Arial" w:hAnsi="Arial" w:cs="Arial"/>
+              </w:rPr>
+              <w:t xml:space="preserve">Aggiornato con </w:t>
+            </w:r>
+            <w:r>
+              <w:rPr>
+                <w:rFonts w:ascii="Arial" w:hAnsi="Arial" w:cs="Arial"/>
+              </w:rPr>
+              <w:t>cifratura</w:t>
+            </w:r>
+          </w:p>
+          <w:p>
+            <w:pPr>
+              <w:pStyle w:val="Paragrafoelenco"/>
+              <w:numPr>
+                <w:ilvl w:val="0"/>
+                <w:numId w:val="21"/>
+              </w:numPr>
+              <w:rPr>
+                <w:rFonts w:ascii="Arial" w:hAnsi="Arial" w:cs="Arial"/>
+              </w:rPr>
+            </w:pPr>
+            <w:r>
+              <w:rPr>
+                <w:rFonts w:ascii="Arial" w:hAnsi="Arial" w:cs="Arial"/>
+              </w:rPr>
+              <w:t>Note</w:t>
+            </w:r>
+          </w:p>
+          <w:p>
+            <w:pPr>
+              <w:pStyle w:val="Paragrafoelenco"/>
+              <w:numPr>
+                <w:ilvl w:val="1"/>
+                <w:numId w:val="21"/>
+              </w:numPr>
+              <w:rPr>
+                <w:rFonts w:ascii="Arial" w:hAnsi="Arial" w:cs="Arial"/>
+              </w:rPr>
+            </w:pPr>
+            <w:r>
+              <w:rPr>
+                <w:rFonts w:ascii="Arial" w:hAnsi="Arial" w:cs="Arial"/>
+              </w:rPr>
+              <w:t>Aggi</w:t>
+            </w:r>
+            <w:r>
+              <w:rPr>
+                <w:rFonts w:ascii="Arial" w:hAnsi="Arial" w:cs="Arial"/>
+              </w:rPr>
+              <w:t>unto download della nota tramite file ZIP</w:t>
+            </w:r>
+            <w:bookmarkStart w:id="3" w:name="_GoBack"/>
+            <w:bookmarkEnd w:id="3"/>
+          </w:p>
+          <w:p>
+            <w:pPr>
+              <w:rPr>
+                <w:rFonts w:ascii="Arial" w:hAnsi="Arial" w:cs="Arial"/>
+              </w:rPr>
+            </w:pPr>
+          </w:p>
+          <w:p>
+            <w:pPr>
+              <w:ind w:left="1080"/>
+              <w:rPr>
+                <w:rFonts w:ascii="Arial" w:hAnsi="Arial" w:cs="Arial"/>
+              </w:rPr>
+            </w:pPr>
+          </w:p>
+          <w:p>
+            <w:pPr>
+              <w:rPr>
+                <w:rFonts w:ascii="Arial" w:hAnsi="Arial" w:cs="Arial"/>
+              </w:rPr>
+            </w:pPr>
+          </w:p>
+          <w:p>
+            <w:pPr>
+              <w:pStyle w:val="Paragrafoelenco"/>
+              <w:rPr>
+                <w:rFonts w:ascii="Arial" w:hAnsi="Arial" w:cs="Arial"/>
+              </w:rPr>
+            </w:pPr>
           </w:p>
           <w:p>
             <w:pPr>
@@ -937,8 +1073,6 @@
               </w:rPr>
               <w:t>, per il resto abbiamo notato una mancanza di informazione per l’utente, deciso di mostrare nome e email all’utente.</w:t>
             </w:r>
-            <w:bookmarkStart w:id="3" w:name="_GoBack"/>
-            <w:bookmarkEnd w:id="3"/>
           </w:p>
         </w:tc>
       </w:tr>
@@ -5194,6 +5328,7 @@
     <w:rsid w:val="00331C62"/>
     <w:rsid w:val="00357BE2"/>
     <w:rsid w:val="00392F29"/>
+    <w:rsid w:val="003B051C"/>
     <w:rsid w:val="003B7632"/>
     <w:rsid w:val="003F5C32"/>
     <w:rsid w:val="003F61E7"/>
@@ -5303,7 +5438,6 @@
     <w:rsid w:val="00F6635C"/>
     <w:rsid w:val="00F902BF"/>
     <w:rsid w:val="00F93792"/>
-    <w:rsid w:val="00FA10BC"/>
     <w:rsid w:val="00FA1CED"/>
     <w:rsid w:val="00FC1BC6"/>
     <w:rsid w:val="00FD1B19"/>
@@ -6100,7 +6234,7 @@
 </file>
 
 <file path=customXml/itemProps1.xml><?xml version="1.0" encoding="utf-8"?>
-<ds:datastoreItem xmlns:ds="http://schemas.openxmlformats.org/officeDocument/2006/customXml" ds:itemID="{3E1C8208-4EAC-40DD-8330-F38A74D49842}">
+<ds:datastoreItem xmlns:ds="http://schemas.openxmlformats.org/officeDocument/2006/customXml" ds:itemID="{3A64925A-6D27-438B-858B-59C897B5E3D5}">
   <ds:schemaRefs>
     <ds:schemaRef ds:uri="http://schemas.openxmlformats.org/officeDocument/2006/bibliography"/>
   </ds:schemaRefs>

</xml_diff>